<commit_message>
feat: Add Office Extension and Phone Line Assignment modules
</commit_message>
<xml_diff>
--- a/Guia_de_Modificacion_y_Mantenimiento_InventarioIT.docx
+++ b/Guia_de_Modificacion_y_Mantenimiento_InventarioIT.docx
@@ -2,6 +2,138 @@
 <file path=word/document.xml><?xml version="1.0" encoding="utf-8"?>
 <w:document xmlns:a="http://schemas.openxmlformats.org/drawingml/2006/main" xmlns:cdr="http://schemas.openxmlformats.org/drawingml/2006/chartDrawing" xmlns:o="urn:schemas-microsoft-com:office:office" xmlns:pic="http://schemas.openxmlformats.org/drawingml/2006/picture" xmlns:r="http://schemas.openxmlformats.org/officeDocument/2006/relationships" xmlns:v="urn:schemas-microsoft-com:vml" xmlns:ve="http://schemas.openxmlformats.org/markup-compatibility/2006" xmlns:vt="http://schemas.openxmlformats.org/officeDocument/2006/docPropsVTypes" xmlns:w="http://schemas.openxmlformats.org/wordprocessingml/2006/main" xmlns:w10="urn:schemas-microsoft-com:office:word" xmlns:wp="http://schemas.openxmlformats.org/drawingml/2006/wordprocessingDrawing" xmlns:wne="http://schemas.microsoft.com/office/word/2006/wordml">
   <w:body>
+    <w:p>
+      <w:r>
+        <w:br w:type="page"/>
+      </w:r>
+    </w:p>
+    <w:p>
+      <w:pPr>
+        <w:pStyle w:val="Heading1"/>
+      </w:pPr>
+      <w:r>
+        <w:t>5. Módulos y Funcionalidades Recientes Implementadas</w:t>
+      </w:r>
+    </w:p>
+    <w:p>
+      <w:r>
+        <w:t>En esta sección se documentan los módulos y cambios estructurales recientes que se han añadido a la arquitectura base de InventarioIT.</w:t>
+      </w:r>
+    </w:p>
+    <w:p>
+      <w:pPr>
+        <w:pStyle w:val="Heading2"/>
+      </w:pPr>
+      <w:r>
+        <w:t>A. Directorio de Líneas Telefónicas</w:t>
+      </w:r>
+    </w:p>
+    <w:p>
+      <w:r>
+        <w:t>Las líneas telefónicas han sido separadas de los dispositivos físicos (celulares) para permitir una gestión independiente de los números, planes de datos y costos. Esto permite que un empleado tenga una línea asignada sin necesidad de tener un equipo celular registrado, y viceversa.</w:t>
+      </w:r>
+    </w:p>
+    <w:p>
+      <w:r>
+        <w:rPr>
+          <w:b/>
+        </w:rPr>
+        <w:t>Estructura del módulo:</w:t>
+        <w:br/>
+      </w:r>
+      <w:r>
+        <w:rPr>
+          <w:b/>
+        </w:rPr>
+        <w:t>• Base de Datos:</w:t>
+      </w:r>
+      <w:r>
+        <w:t xml:space="preserve"> Se crearon las tablas `phone_lines` y `phone_line_assignments`.</w:t>
+        <w:br/>
+      </w:r>
+      <w:r>
+        <w:rPr>
+          <w:b/>
+        </w:rPr>
+        <w:t>• Modelos Eloquent:</w:t>
+      </w:r>
+      <w:r>
+        <w:t xml:space="preserve"> `app/Models/PhoneLine.php` y `app/Models/PhoneLineAssignment.php`. Se agregó la relación en `Employee.php`.</w:t>
+        <w:br/>
+      </w:r>
+      <w:r>
+        <w:rPr>
+          <w:b/>
+        </w:rPr>
+        <w:t>• Controlador:</w:t>
+      </w:r>
+      <w:r>
+        <w:t xml:space="preserve"> `app/Http/Controllers/PhoneLineController.php`.</w:t>
+        <w:br/>
+      </w:r>
+      <w:r>
+        <w:rPr>
+          <w:b/>
+        </w:rPr>
+        <w:t>• Vistas:</w:t>
+      </w:r>
+      <w:r>
+        <w:t xml:space="preserve"> `resources/views/phone-lines/` (incluye index, create, edit, show, history).</w:t>
+        <w:br/>
+      </w:r>
+      <w:r>
+        <w:rPr>
+          <w:b/>
+        </w:rPr>
+        <w:t>• Importación/Exportación:</w:t>
+      </w:r>
+      <w:r>
+        <w:t xml:space="preserve"> Se sincronizó con las plantillas de Excel de empleados para asignar las líneas al importar el inventario global.</w:t>
+        <w:br/>
+      </w:r>
+    </w:p>
+    <w:p>
+      <w:pPr>
+        <w:pStyle w:val="Heading2"/>
+      </w:pPr>
+      <w:r>
+        <w:t>B. Gestión de BitLocker para Equipos</w:t>
+      </w:r>
+    </w:p>
+    <w:p>
+      <w:r>
+        <w:t>Se agregaron campos específicos para gestionar el cifrado de unidades de almacenamiento (BitLocker) exclusivamente para equipos de cómputo.</w:t>
+      </w:r>
+    </w:p>
+    <w:p>
+      <w:r>
+        <w:rPr>
+          <w:b/>
+        </w:rPr>
+        <w:t>Estructura del módulo:</w:t>
+        <w:br/>
+      </w:r>
+      <w:r>
+        <w:rPr>
+          <w:b/>
+        </w:rPr>
+        <w:t>• Base de Datos:</w:t>
+      </w:r>
+      <w:r>
+        <w:t xml:space="preserve"> Nuevos campos `bitlocker_identifier` y `bitlocker_key` en la tabla `devices`.</w:t>
+        <w:br/>
+      </w:r>
+      <w:r>
+        <w:rPr>
+          <w:b/>
+        </w:rPr>
+        <w:t>• Vistas:</w:t>
+      </w:r>
+      <w:r>
+        <w:t xml:space="preserve"> Se añadieron los campos ocultos dinámicamente usando Alpine.js (`x-show="isComputer"` y `x-bind:disabled="!isComputer"`) en `resources/views/devices/create.blade.php` y `edit.blade.php`, previniendo que se guarden en registros de smartphones u otros dispositivos.</w:t>
+        <w:br/>
+      </w:r>
+    </w:p>
     <w:sectPr>
       <w:pgSz w:w="12240" w:h="15840" w:orient="portrait"/>
       <w:pgMar w:top="1440" w:right="1800" w:bottom="1440" w:left="1800" w:header="720" w:footer="720" w:gutter="0"/>

</xml_diff>